<commit_message>
Karte 14.10. bis 16.10.2026 (aus der App)
</commit_message>
<xml_diff>
--- a/karten/2026-10-14/karte.docx
+++ b/karten/2026-10-14/karte.docx
@@ -360,7 +360,7 @@
                 <w:sz w:val="20"/>
                 <w:szCs w:val="20"/>
               </w:rPr>
-              <w:t xml:space="preserve">Zartes paniertes Schweineschnitzel, dazu Ofenkartoffeln mit geschmorten Cherrytomaten, vorweg einen marktfrischen Beilagensalat</w:t>
+              <w:t xml:space="preserve">Zartes paniertes Schweineschnitzel dazu Ofenkartoffeln mit geschmorten Cherrytomaten, vorweg einen marktfrischen Beilagensalat</w:t>
             </w:r>
           </w:p>
         </w:tc>
@@ -495,7 +495,7 @@
                 <w:sz w:val="20"/>
                 <w:szCs w:val="20"/>
               </w:rPr>
-              <w:t xml:space="preserve">Zartes Fischfilet des Tages an feinem Spinat-Risotto, vorweg einen marktfrischen Beilagensalat</w:t>
+              <w:t xml:space="preserve">Zartes Fischfilet des Tages an feinem Spinatrisotto, vorweg einen marktfrischen Beilagensalat</w:t>
             </w:r>
           </w:p>
         </w:tc>

</xml_diff>